<commit_message>
payroll service db + db seed data
</commit_message>
<xml_diff>
--- a/Project Plan/Software Architecture Document.docx
+++ b/Project Plan/Software Architecture Document.docx
@@ -670,6 +670,7 @@
           <w:rFonts w:ascii="Times New Roman" w:hAnsi="Times New Roman" w:cs="Times New Roman"/>
           <w:sz w:val="28"/>
           <w:szCs w:val="28"/>
+          <w:lang w:val="en-US"/>
         </w:rPr>
       </w:pPr>
       <w:r>
@@ -677,6 +678,7 @@
           <w:rFonts w:ascii="Times New Roman" w:hAnsi="Times New Roman" w:cs="Times New Roman"/>
           <w:sz w:val="28"/>
           <w:szCs w:val="28"/>
+          <w:lang w:val="en-US"/>
         </w:rPr>
         <w:t>Scope</w:t>
       </w:r>
@@ -1567,6 +1569,621 @@
           <w:lang w:val="en-US"/>
         </w:rPr>
       </w:pPr>
+    </w:p>
+    <w:p>
+      <w:pPr>
+        <w:rPr>
+          <w:rFonts w:ascii="Times New Roman" w:hAnsi="Times New Roman" w:cs="Times New Roman"/>
+          <w:lang w:val="en-US"/>
+        </w:rPr>
+      </w:pPr>
+      <w:r>
+        <w:rPr>
+          <w:rFonts w:ascii="Times New Roman" w:hAnsi="Times New Roman" w:cs="Times New Roman"/>
+          <w:lang w:val="en-US"/>
+        </w:rPr>
+        <w:t>According to Dutch law, an employer must provide employees with a payslip ("loonstrook") at the first payment and whenever there are changes to salary or deductions. The payslip must contain specific mandatory details. The core required items are the identities of the employer and employee, the employment period, the number of hours worked, gross salary ("brutoloon"), detailed breakdown of gross wage components such as base salary, minimum vacation allowance, and bonuses, whether minimum wage rules apply, an indication if wage tax credit ("loonheffingskorting") is used, deductions for tax and social security, the net salary ("nettoloon"), and information about the employment contract type (business.gov.nl; Rijksoverheid; Parakar).</w:t>
+      </w:r>
+    </w:p>
+    <w:p>
+      <w:pPr>
+        <w:rPr>
+          <w:rFonts w:ascii="Times New Roman" w:hAnsi="Times New Roman" w:cs="Times New Roman"/>
+          <w:lang w:val="en-US"/>
+        </w:rPr>
+      </w:pPr>
+      <w:r>
+        <w:rPr>
+          <w:rFonts w:ascii="Times New Roman" w:hAnsi="Times New Roman" w:cs="Times New Roman"/>
+          <w:lang w:val="en-US"/>
+        </w:rPr>
+        <w:t>Explanation of key terms typically found on Dutch payslips:</w:t>
+      </w:r>
+    </w:p>
+    <w:p>
+      <w:pPr>
+        <w:rPr>
+          <w:rFonts w:ascii="Times New Roman" w:hAnsi="Times New Roman" w:cs="Times New Roman"/>
+          <w:lang w:val="en-US"/>
+        </w:rPr>
+      </w:pPr>
+      <w:r>
+        <w:rPr>
+          <w:rFonts w:ascii="Times New Roman" w:hAnsi="Times New Roman" w:cs="Times New Roman"/>
+          <w:lang w:val="en-US"/>
+        </w:rPr>
+        <w:t>"Brutoloon":</w:t>
+      </w:r>
+      <w:r>
+        <w:rPr>
+          <w:rFonts w:ascii="Times New Roman" w:hAnsi="Times New Roman" w:cs="Times New Roman"/>
+          <w:lang w:val="en-US"/>
+        </w:rPr>
+        <w:br/>
+        <w:t>The employee’s gross salary before deductions like taxes, pension contributions, and other employee-side withholdings. This figure forms the basis for taxable income calculations (Robin.jobs).</w:t>
+      </w:r>
+    </w:p>
+    <w:p>
+      <w:pPr>
+        <w:rPr>
+          <w:rFonts w:ascii="Times New Roman" w:hAnsi="Times New Roman" w:cs="Times New Roman"/>
+          <w:lang w:val="en-US"/>
+        </w:rPr>
+      </w:pPr>
+      <w:r>
+        <w:rPr>
+          <w:rFonts w:ascii="Times New Roman" w:hAnsi="Times New Roman" w:cs="Times New Roman"/>
+          <w:lang w:val="en-US"/>
+        </w:rPr>
+        <w:t>"Nettoloon":</w:t>
+      </w:r>
+      <w:r>
+        <w:rPr>
+          <w:rFonts w:ascii="Times New Roman" w:hAnsi="Times New Roman" w:cs="Times New Roman"/>
+          <w:lang w:val="en-US"/>
+        </w:rPr>
+        <w:br/>
+        <w:t>The salary amount after deductions, representing what the employee actually receives in their bank account after income tax, social security, pension, and other withholdings (DutchReview).</w:t>
+      </w:r>
+    </w:p>
+    <w:p>
+      <w:pPr>
+        <w:rPr>
+          <w:rFonts w:ascii="Times New Roman" w:hAnsi="Times New Roman" w:cs="Times New Roman"/>
+          <w:lang w:val="en-US"/>
+        </w:rPr>
+      </w:pPr>
+      <w:r>
+        <w:rPr>
+          <w:rFonts w:ascii="Times New Roman" w:hAnsi="Times New Roman" w:cs="Times New Roman"/>
+          <w:lang w:val="en-US"/>
+        </w:rPr>
+        <w:t>"Vakantiegeld" (holiday pay):</w:t>
+      </w:r>
+      <w:r>
+        <w:rPr>
+          <w:rFonts w:ascii="Times New Roman" w:hAnsi="Times New Roman" w:cs="Times New Roman"/>
+          <w:lang w:val="en-US"/>
+        </w:rPr>
+        <w:br/>
+        <w:t>Typically calculated at 8% of the gross annual salary, accumulated throughout the year and commonly paid in May or periodically throughout the year. Holiday pay is subject to taxation, sometimes at a special withholding rate if it’s treated as special remuneration (Vanoers.nl; DutchReview).</w:t>
+      </w:r>
+    </w:p>
+    <w:p>
+      <w:pPr>
+        <w:rPr>
+          <w:rFonts w:ascii="Times New Roman" w:hAnsi="Times New Roman" w:cs="Times New Roman"/>
+          <w:lang w:val="en-US"/>
+        </w:rPr>
+      </w:pPr>
+      <w:r>
+        <w:rPr>
+          <w:rFonts w:ascii="Times New Roman" w:hAnsi="Times New Roman" w:cs="Times New Roman"/>
+          <w:lang w:val="en-US"/>
+        </w:rPr>
+        <w:lastRenderedPageBreak/>
+        <w:t>"Periodieke uitbetaling vakantieuren/normale uren/aantal uren per week":</w:t>
+      </w:r>
+      <w:r>
+        <w:rPr>
+          <w:rFonts w:ascii="Times New Roman" w:hAnsi="Times New Roman" w:cs="Times New Roman"/>
+          <w:lang w:val="en-US"/>
+        </w:rPr>
+        <w:br/>
+        <w:t>These entries specify the number of hours worked or contracted per pay period, including vacation hours accrued or paid, as well as the contractual standard working hours per week (Vanoers.nl).</w:t>
+      </w:r>
+    </w:p>
+    <w:p>
+      <w:pPr>
+        <w:rPr>
+          <w:rFonts w:ascii="Times New Roman" w:hAnsi="Times New Roman" w:cs="Times New Roman"/>
+          <w:lang w:val="en-US"/>
+        </w:rPr>
+      </w:pPr>
+      <w:r>
+        <w:rPr>
+          <w:rFonts w:ascii="Times New Roman" w:hAnsi="Times New Roman" w:cs="Times New Roman"/>
+          <w:lang w:val="en-US"/>
+        </w:rPr>
+        <w:t>"Basispensioen":</w:t>
+      </w:r>
+      <w:r>
+        <w:rPr>
+          <w:rFonts w:ascii="Times New Roman" w:hAnsi="Times New Roman" w:cs="Times New Roman"/>
+          <w:lang w:val="en-US"/>
+        </w:rPr>
+        <w:br/>
+        <w:t>Basic pension contributions paid into an employer-managed pension fund. Contributions reduce taxable salary. The pension contribution may cover old-age pensions, disability, and survivor benefits depending on the specific pension fund (nwo-i.nl; Vanoers.nl).</w:t>
+      </w:r>
+    </w:p>
+    <w:p>
+      <w:pPr>
+        <w:rPr>
+          <w:rFonts w:ascii="Times New Roman" w:hAnsi="Times New Roman" w:cs="Times New Roman"/>
+          <w:lang w:val="en-US"/>
+        </w:rPr>
+      </w:pPr>
+      <w:r>
+        <w:rPr>
+          <w:rFonts w:ascii="Times New Roman" w:hAnsi="Times New Roman" w:cs="Times New Roman"/>
+          <w:lang w:val="en-US"/>
+        </w:rPr>
+        <w:t>"Premie HOP":</w:t>
+      </w:r>
+      <w:r>
+        <w:rPr>
+          <w:rFonts w:ascii="Times New Roman" w:hAnsi="Times New Roman" w:cs="Times New Roman"/>
+          <w:lang w:val="en-US"/>
+        </w:rPr>
+        <w:br/>
+        <w:t>Specific to the hospitality sector ("horeca"), this refers to the Horeca Ontwikkel Platform (HOP) premium. Starting from 2025, both the employer and employee each pay 0.1% of payroll into HOP, equally shared. This deduction must appear explicitly on the payslip (Nederlands Horeca Gilde; BCOP.nl).</w:t>
+      </w:r>
+    </w:p>
+    <w:p>
+      <w:pPr>
+        <w:rPr>
+          <w:rFonts w:ascii="Times New Roman" w:hAnsi="Times New Roman" w:cs="Times New Roman"/>
+          <w:lang w:val="en-US"/>
+        </w:rPr>
+      </w:pPr>
+      <w:r>
+        <w:rPr>
+          <w:rFonts w:ascii="Times New Roman" w:hAnsi="Times New Roman" w:cs="Times New Roman"/>
+          <w:lang w:val="en-US"/>
+        </w:rPr>
+        <w:t>"Gedifferentieerde premie Whk":</w:t>
+      </w:r>
+      <w:r>
+        <w:rPr>
+          <w:rFonts w:ascii="Times New Roman" w:hAnsi="Times New Roman" w:cs="Times New Roman"/>
+          <w:lang w:val="en-US"/>
+        </w:rPr>
+        <w:br/>
+        <w:t>The differentiated premium for the Return-to-Work Fund ("Werkhervattingskas," WHK). It is an employer contribution related to employee sickness, disability, and reintegration into the workplace. This premium has different parts (WGA fixed, WGA flexible, ZW flexible) depending on employer size and risk factors, and it must be explicitly shown on the payslip (business.gov.nl; UWV; Management Site; Doorneweerd).</w:t>
+      </w:r>
+    </w:p>
+    <w:p>
+      <w:pPr>
+        <w:rPr>
+          <w:rFonts w:ascii="Times New Roman" w:hAnsi="Times New Roman" w:cs="Times New Roman"/>
+          <w:lang w:val="en-US"/>
+        </w:rPr>
+      </w:pPr>
+      <w:r>
+        <w:rPr>
+          <w:rFonts w:ascii="Times New Roman" w:hAnsi="Times New Roman" w:cs="Times New Roman"/>
+          <w:lang w:val="en-US"/>
+        </w:rPr>
+        <w:t>"Heffingskorting" (wage tax credit):</w:t>
+      </w:r>
+      <w:r>
+        <w:rPr>
+          <w:rFonts w:ascii="Times New Roman" w:hAnsi="Times New Roman" w:cs="Times New Roman"/>
+          <w:lang w:val="en-US"/>
+        </w:rPr>
+        <w:br/>
+        <w:t>Reduces the amount of income tax and national insurance contributions withheld from the salary. Common credits include the general tax credit and labor tax credit ("arbeidskorting"). This credit can only be applied through one employer at a time, and the payslip must indicate its usage explicitly (Robin.jobs; IamExpat).</w:t>
+      </w:r>
+    </w:p>
+    <w:p>
+      <w:pPr>
+        <w:rPr>
+          <w:rFonts w:ascii="Times New Roman" w:hAnsi="Times New Roman" w:cs="Times New Roman"/>
+          <w:lang w:val="en-US"/>
+        </w:rPr>
+      </w:pPr>
+      <w:r>
+        <w:rPr>
+          <w:rFonts w:ascii="Times New Roman" w:hAnsi="Times New Roman" w:cs="Times New Roman"/>
+          <w:lang w:val="en-US"/>
+        </w:rPr>
+        <w:t>Other mandatory or common fields:</w:t>
+      </w:r>
+      <w:r>
+        <w:rPr>
+          <w:rFonts w:ascii="Times New Roman" w:hAnsi="Times New Roman" w:cs="Times New Roman"/>
+          <w:lang w:val="en-US"/>
+        </w:rPr>
+        <w:br/>
+        <w:t>The employee’s citizen service number ("BSN"), date of birth, applicable minimum wage, addresses of the employer and employee, contract type specifics (written employment agreement, indefinite, zero-hours, or on-call), gross annual salary figures, cumulative year-to-date totals, and identification of special remuneration (EURAXESS; Parakar; Rijksoverheid).</w:t>
+      </w:r>
+    </w:p>
+    <w:p>
+      <w:pPr>
+        <w:rPr>
+          <w:rFonts w:ascii="Times New Roman" w:hAnsi="Times New Roman" w:cs="Times New Roman"/>
+          <w:lang w:val="en-US"/>
+        </w:rPr>
+      </w:pPr>
+      <w:r>
+        <w:rPr>
+          <w:rFonts w:ascii="Times New Roman" w:hAnsi="Times New Roman" w:cs="Times New Roman"/>
+          <w:lang w:val="en-US"/>
+        </w:rPr>
+        <w:t>Payslip structure typically consists of three main sections:</w:t>
+      </w:r>
+    </w:p>
+    <w:p>
+      <w:pPr>
+        <w:numPr>
+          <w:ilvl w:val="0"/>
+          <w:numId w:val="2"/>
+        </w:numPr>
+        <w:rPr>
+          <w:rFonts w:ascii="Times New Roman" w:hAnsi="Times New Roman" w:cs="Times New Roman"/>
+          <w:lang w:val="en-US"/>
+        </w:rPr>
+      </w:pPr>
+      <w:r>
+        <w:rPr>
+          <w:rFonts w:ascii="Times New Roman" w:hAnsi="Times New Roman" w:cs="Times New Roman"/>
+          <w:lang w:val="en-US"/>
+        </w:rPr>
+        <w:t>Top: Employer/employee identities, contract specifics.</w:t>
+      </w:r>
+    </w:p>
+    <w:p>
+      <w:pPr>
+        <w:numPr>
+          <w:ilvl w:val="0"/>
+          <w:numId w:val="2"/>
+        </w:numPr>
+        <w:rPr>
+          <w:rFonts w:ascii="Times New Roman" w:hAnsi="Times New Roman" w:cs="Times New Roman"/>
+          <w:lang w:val="en-US"/>
+        </w:rPr>
+      </w:pPr>
+      <w:r>
+        <w:rPr>
+          <w:rFonts w:ascii="Times New Roman" w:hAnsi="Times New Roman" w:cs="Times New Roman"/>
+          <w:lang w:val="en-US"/>
+        </w:rPr>
+        <w:t>Middle: Calculation details for gross wages, pension bases, special remunerations like holiday pay.</w:t>
+      </w:r>
+    </w:p>
+    <w:p>
+      <w:pPr>
+        <w:numPr>
+          <w:ilvl w:val="0"/>
+          <w:numId w:val="2"/>
+        </w:numPr>
+        <w:rPr>
+          <w:rFonts w:ascii="Times New Roman" w:hAnsi="Times New Roman" w:cs="Times New Roman"/>
+          <w:lang w:val="en-US"/>
+        </w:rPr>
+      </w:pPr>
+      <w:r>
+        <w:rPr>
+          <w:rFonts w:ascii="Times New Roman" w:hAnsi="Times New Roman" w:cs="Times New Roman"/>
+          <w:lang w:val="en-US"/>
+        </w:rPr>
+        <w:t>Bottom: Deductions breakdown and net salary calculation.</w:t>
+      </w:r>
+    </w:p>
+    <w:p>
+      <w:pPr>
+        <w:rPr>
+          <w:rFonts w:ascii="Times New Roman" w:hAnsi="Times New Roman" w:cs="Times New Roman"/>
+          <w:lang w:val="en-US"/>
+        </w:rPr>
+      </w:pPr>
+      <w:r>
+        <w:rPr>
+          <w:rFonts w:ascii="Times New Roman" w:hAnsi="Times New Roman" w:cs="Times New Roman"/>
+          <w:lang w:val="en-US"/>
+        </w:rPr>
+        <w:t>Special remuneration like bonuses or holiday pay often have separate withholding rates. Employer-side premiums (such as WHK) should be transparent even though they are not deducted from the employee’s net salary but must still be accounted for in payroll reports (Vanoers.nl; DutchReview; nwo-i.nl).</w:t>
+      </w:r>
+    </w:p>
+    <w:p>
+      <w:pPr>
+        <w:rPr>
+          <w:rFonts w:ascii="Times New Roman" w:hAnsi="Times New Roman" w:cs="Times New Roman"/>
+          <w:lang w:val="en-US"/>
+        </w:rPr>
+      </w:pPr>
+      <w:r>
+        <w:rPr>
+          <w:rFonts w:ascii="Times New Roman" w:hAnsi="Times New Roman" w:cs="Times New Roman"/>
+          <w:lang w:val="en-US"/>
+        </w:rPr>
+        <w:lastRenderedPageBreak/>
+        <w:t>Practical considerations:</w:t>
+      </w:r>
+      <w:r>
+        <w:rPr>
+          <w:rFonts w:ascii="Times New Roman" w:hAnsi="Times New Roman" w:cs="Times New Roman"/>
+          <w:lang w:val="en-US"/>
+        </w:rPr>
+        <w:br/>
+        <w:t>Employers must issue payslips upon first payment and subsequent payroll changes. Digital payslips must be downloadable and savable by the employee. Annual income statements summarizing the year's pay are sent in January or February and reported to the Dutch Tax Authority ("Belastingdienst"). Collective labor agreements ("CAO") may specify additional required fields or specific formats (business.gov.nl; Parakar).</w:t>
+      </w:r>
+    </w:p>
+    <w:p>
+      <w:pPr>
+        <w:rPr>
+          <w:rFonts w:ascii="Times New Roman" w:hAnsi="Times New Roman" w:cs="Times New Roman"/>
+          <w:lang w:val="en-US"/>
+        </w:rPr>
+      </w:pPr>
+      <w:r>
+        <w:rPr>
+          <w:rFonts w:ascii="Times New Roman" w:hAnsi="Times New Roman" w:cs="Times New Roman"/>
+          <w:lang w:val="en-US"/>
+        </w:rPr>
+        <w:t>Recommended steps for implementing a payslip in a payroll system include clearly capturing employee details, contract type flags, gross salary components, pension and WHK contributions, HOP deductions for the hospitality sector, wage tax credits, income tax, and social security deductions, net pay amounts, cumulative year-to-date totals, and essential metadata (such as pay period and employer data). Logic must exist to manage special rates (like holiday pay withholding), and enforcement of rules ensuring wage tax credits are applied correctly when employees have multiple jobs.</w:t>
+      </w:r>
+    </w:p>
+    <w:p>
+      <w:pPr>
+        <w:rPr>
+          <w:rFonts w:ascii="Times New Roman" w:hAnsi="Times New Roman" w:cs="Times New Roman"/>
+        </w:rPr>
+      </w:pPr>
+      <w:r>
+        <w:rPr>
+          <w:rFonts w:ascii="Times New Roman" w:hAnsi="Times New Roman" w:cs="Times New Roman"/>
+        </w:rPr>
+        <w:t>Sources:</w:t>
+      </w:r>
+    </w:p>
+    <w:p>
+      <w:pPr>
+        <w:numPr>
+          <w:ilvl w:val="0"/>
+          <w:numId w:val="3"/>
+        </w:numPr>
+        <w:rPr>
+          <w:rFonts w:ascii="Times New Roman" w:hAnsi="Times New Roman" w:cs="Times New Roman"/>
+        </w:rPr>
+      </w:pPr>
+      <w:r>
+        <w:rPr>
+          <w:rFonts w:ascii="Times New Roman" w:hAnsi="Times New Roman" w:cs="Times New Roman"/>
+        </w:rPr>
+        <w:t>business.gov.nl</w:t>
+      </w:r>
+    </w:p>
+    <w:p>
+      <w:pPr>
+        <w:numPr>
+          <w:ilvl w:val="0"/>
+          <w:numId w:val="3"/>
+        </w:numPr>
+        <w:rPr>
+          <w:rFonts w:ascii="Times New Roman" w:hAnsi="Times New Roman" w:cs="Times New Roman"/>
+        </w:rPr>
+      </w:pPr>
+      <w:r>
+        <w:rPr>
+          <w:rFonts w:ascii="Times New Roman" w:hAnsi="Times New Roman" w:cs="Times New Roman"/>
+        </w:rPr>
+        <w:t>Rijksoverheid</w:t>
+      </w:r>
+    </w:p>
+    <w:p>
+      <w:pPr>
+        <w:numPr>
+          <w:ilvl w:val="0"/>
+          <w:numId w:val="3"/>
+        </w:numPr>
+        <w:rPr>
+          <w:rFonts w:ascii="Times New Roman" w:hAnsi="Times New Roman" w:cs="Times New Roman"/>
+        </w:rPr>
+      </w:pPr>
+      <w:r>
+        <w:rPr>
+          <w:rFonts w:ascii="Times New Roman" w:hAnsi="Times New Roman" w:cs="Times New Roman"/>
+        </w:rPr>
+        <w:t>Parakar</w:t>
+      </w:r>
+    </w:p>
+    <w:p>
+      <w:pPr>
+        <w:numPr>
+          <w:ilvl w:val="0"/>
+          <w:numId w:val="3"/>
+        </w:numPr>
+        <w:rPr>
+          <w:rFonts w:ascii="Times New Roman" w:hAnsi="Times New Roman" w:cs="Times New Roman"/>
+        </w:rPr>
+      </w:pPr>
+      <w:r>
+        <w:rPr>
+          <w:rFonts w:ascii="Times New Roman" w:hAnsi="Times New Roman" w:cs="Times New Roman"/>
+        </w:rPr>
+        <w:t>Robin.jobs</w:t>
+      </w:r>
+    </w:p>
+    <w:p>
+      <w:pPr>
+        <w:numPr>
+          <w:ilvl w:val="0"/>
+          <w:numId w:val="3"/>
+        </w:numPr>
+        <w:rPr>
+          <w:rFonts w:ascii="Times New Roman" w:hAnsi="Times New Roman" w:cs="Times New Roman"/>
+        </w:rPr>
+      </w:pPr>
+      <w:r>
+        <w:rPr>
+          <w:rFonts w:ascii="Times New Roman" w:hAnsi="Times New Roman" w:cs="Times New Roman"/>
+        </w:rPr>
+        <w:t>DutchReview</w:t>
+      </w:r>
+    </w:p>
+    <w:p>
+      <w:pPr>
+        <w:numPr>
+          <w:ilvl w:val="0"/>
+          <w:numId w:val="3"/>
+        </w:numPr>
+        <w:rPr>
+          <w:rFonts w:ascii="Times New Roman" w:hAnsi="Times New Roman" w:cs="Times New Roman"/>
+        </w:rPr>
+      </w:pPr>
+      <w:r>
+        <w:rPr>
+          <w:rFonts w:ascii="Times New Roman" w:hAnsi="Times New Roman" w:cs="Times New Roman"/>
+        </w:rPr>
+        <w:t>Vanoers.nl</w:t>
+      </w:r>
+    </w:p>
+    <w:p>
+      <w:pPr>
+        <w:numPr>
+          <w:ilvl w:val="0"/>
+          <w:numId w:val="3"/>
+        </w:numPr>
+        <w:rPr>
+          <w:rFonts w:ascii="Times New Roman" w:hAnsi="Times New Roman" w:cs="Times New Roman"/>
+        </w:rPr>
+      </w:pPr>
+      <w:r>
+        <w:rPr>
+          <w:rFonts w:ascii="Times New Roman" w:hAnsi="Times New Roman" w:cs="Times New Roman"/>
+        </w:rPr>
+        <w:t>nwo-i.nl</w:t>
+      </w:r>
+    </w:p>
+    <w:p>
+      <w:pPr>
+        <w:numPr>
+          <w:ilvl w:val="0"/>
+          <w:numId w:val="3"/>
+        </w:numPr>
+        <w:rPr>
+          <w:rFonts w:ascii="Times New Roman" w:hAnsi="Times New Roman" w:cs="Times New Roman"/>
+        </w:rPr>
+      </w:pPr>
+      <w:r>
+        <w:rPr>
+          <w:rFonts w:ascii="Times New Roman" w:hAnsi="Times New Roman" w:cs="Times New Roman"/>
+        </w:rPr>
+        <w:t>Nederlands Horeca Gilde</w:t>
+      </w:r>
+    </w:p>
+    <w:p>
+      <w:pPr>
+        <w:numPr>
+          <w:ilvl w:val="0"/>
+          <w:numId w:val="3"/>
+        </w:numPr>
+        <w:rPr>
+          <w:rFonts w:ascii="Times New Roman" w:hAnsi="Times New Roman" w:cs="Times New Roman"/>
+        </w:rPr>
+      </w:pPr>
+      <w:r>
+        <w:rPr>
+          <w:rFonts w:ascii="Times New Roman" w:hAnsi="Times New Roman" w:cs="Times New Roman"/>
+        </w:rPr>
+        <w:t>BCOP.nl</w:t>
+      </w:r>
+    </w:p>
+    <w:p>
+      <w:pPr>
+        <w:numPr>
+          <w:ilvl w:val="0"/>
+          <w:numId w:val="3"/>
+        </w:numPr>
+        <w:rPr>
+          <w:rFonts w:ascii="Times New Roman" w:hAnsi="Times New Roman" w:cs="Times New Roman"/>
+        </w:rPr>
+      </w:pPr>
+      <w:r>
+        <w:rPr>
+          <w:rFonts w:ascii="Times New Roman" w:hAnsi="Times New Roman" w:cs="Times New Roman"/>
+        </w:rPr>
+        <w:t>UWV</w:t>
+      </w:r>
+    </w:p>
+    <w:p>
+      <w:pPr>
+        <w:numPr>
+          <w:ilvl w:val="0"/>
+          <w:numId w:val="3"/>
+        </w:numPr>
+        <w:rPr>
+          <w:rFonts w:ascii="Times New Roman" w:hAnsi="Times New Roman" w:cs="Times New Roman"/>
+        </w:rPr>
+      </w:pPr>
+      <w:r>
+        <w:rPr>
+          <w:rFonts w:ascii="Times New Roman" w:hAnsi="Times New Roman" w:cs="Times New Roman"/>
+        </w:rPr>
+        <w:t>Management Site</w:t>
+      </w:r>
+    </w:p>
+    <w:p>
+      <w:pPr>
+        <w:numPr>
+          <w:ilvl w:val="0"/>
+          <w:numId w:val="3"/>
+        </w:numPr>
+        <w:rPr>
+          <w:rFonts w:ascii="Times New Roman" w:hAnsi="Times New Roman" w:cs="Times New Roman"/>
+        </w:rPr>
+      </w:pPr>
+      <w:r>
+        <w:rPr>
+          <w:rFonts w:ascii="Times New Roman" w:hAnsi="Times New Roman" w:cs="Times New Roman"/>
+        </w:rPr>
+        <w:t>Doorneweerd</w:t>
+      </w:r>
+    </w:p>
+    <w:p>
+      <w:pPr>
+        <w:numPr>
+          <w:ilvl w:val="0"/>
+          <w:numId w:val="3"/>
+        </w:numPr>
+        <w:rPr>
+          <w:rFonts w:ascii="Times New Roman" w:hAnsi="Times New Roman" w:cs="Times New Roman"/>
+        </w:rPr>
+      </w:pPr>
+      <w:r>
+        <w:rPr>
+          <w:rFonts w:ascii="Times New Roman" w:hAnsi="Times New Roman" w:cs="Times New Roman"/>
+        </w:rPr>
+        <w:t>IamExpat</w:t>
+      </w:r>
+    </w:p>
+    <w:p>
+      <w:pPr>
+        <w:numPr>
+          <w:ilvl w:val="0"/>
+          <w:numId w:val="3"/>
+        </w:numPr>
+        <w:rPr>
+          <w:rFonts w:ascii="Times New Roman" w:hAnsi="Times New Roman" w:cs="Times New Roman"/>
+        </w:rPr>
+      </w:pPr>
+      <w:r>
+        <w:rPr>
+          <w:rFonts w:ascii="Times New Roman" w:hAnsi="Times New Roman" w:cs="Times New Roman"/>
+        </w:rPr>
+        <w:t>EURAXESS</w:t>
+      </w:r>
     </w:p>
     <w:p>
       <w:pPr>
@@ -1804,8 +2421,276 @@
       </w:pPr>
     </w:lvl>
   </w:abstractNum>
+  <w:abstractNum w:abstractNumId="1" w15:restartNumberingAfterBreak="0">
+    <w:nsid w:val="3B3116FB"/>
+    <w:multiLevelType w:val="multilevel"/>
+    <w:tmpl w:val="C4629632"/>
+    <w:lvl w:ilvl="0">
+      <w:start w:val="1"/>
+      <w:numFmt w:val="bullet"/>
+      <w:lvlText w:val=""/>
+      <w:lvlJc w:val="left"/>
+      <w:pPr>
+        <w:tabs>
+          <w:tab w:val="num" w:pos="720"/>
+        </w:tabs>
+        <w:ind w:left="720" w:hanging="360"/>
+      </w:pPr>
+      <w:rPr>
+        <w:rFonts w:ascii="Symbol" w:hAnsi="Symbol" w:hint="default"/>
+        <w:sz w:val="20"/>
+      </w:rPr>
+    </w:lvl>
+    <w:lvl w:ilvl="1" w:tentative="1">
+      <w:start w:val="1"/>
+      <w:numFmt w:val="bullet"/>
+      <w:lvlText w:val="o"/>
+      <w:lvlJc w:val="left"/>
+      <w:pPr>
+        <w:tabs>
+          <w:tab w:val="num" w:pos="1440"/>
+        </w:tabs>
+        <w:ind w:left="1440" w:hanging="360"/>
+      </w:pPr>
+      <w:rPr>
+        <w:rFonts w:ascii="Courier New" w:hAnsi="Courier New" w:hint="default"/>
+        <w:sz w:val="20"/>
+      </w:rPr>
+    </w:lvl>
+    <w:lvl w:ilvl="2" w:tentative="1">
+      <w:start w:val="1"/>
+      <w:numFmt w:val="bullet"/>
+      <w:lvlText w:val=""/>
+      <w:lvlJc w:val="left"/>
+      <w:pPr>
+        <w:tabs>
+          <w:tab w:val="num" w:pos="2160"/>
+        </w:tabs>
+        <w:ind w:left="2160" w:hanging="360"/>
+      </w:pPr>
+      <w:rPr>
+        <w:rFonts w:ascii="Wingdings" w:hAnsi="Wingdings" w:hint="default"/>
+        <w:sz w:val="20"/>
+      </w:rPr>
+    </w:lvl>
+    <w:lvl w:ilvl="3" w:tentative="1">
+      <w:start w:val="1"/>
+      <w:numFmt w:val="bullet"/>
+      <w:lvlText w:val=""/>
+      <w:lvlJc w:val="left"/>
+      <w:pPr>
+        <w:tabs>
+          <w:tab w:val="num" w:pos="2880"/>
+        </w:tabs>
+        <w:ind w:left="2880" w:hanging="360"/>
+      </w:pPr>
+      <w:rPr>
+        <w:rFonts w:ascii="Wingdings" w:hAnsi="Wingdings" w:hint="default"/>
+        <w:sz w:val="20"/>
+      </w:rPr>
+    </w:lvl>
+    <w:lvl w:ilvl="4" w:tentative="1">
+      <w:start w:val="1"/>
+      <w:numFmt w:val="bullet"/>
+      <w:lvlText w:val=""/>
+      <w:lvlJc w:val="left"/>
+      <w:pPr>
+        <w:tabs>
+          <w:tab w:val="num" w:pos="3600"/>
+        </w:tabs>
+        <w:ind w:left="3600" w:hanging="360"/>
+      </w:pPr>
+      <w:rPr>
+        <w:rFonts w:ascii="Wingdings" w:hAnsi="Wingdings" w:hint="default"/>
+        <w:sz w:val="20"/>
+      </w:rPr>
+    </w:lvl>
+    <w:lvl w:ilvl="5" w:tentative="1">
+      <w:start w:val="1"/>
+      <w:numFmt w:val="bullet"/>
+      <w:lvlText w:val=""/>
+      <w:lvlJc w:val="left"/>
+      <w:pPr>
+        <w:tabs>
+          <w:tab w:val="num" w:pos="4320"/>
+        </w:tabs>
+        <w:ind w:left="4320" w:hanging="360"/>
+      </w:pPr>
+      <w:rPr>
+        <w:rFonts w:ascii="Wingdings" w:hAnsi="Wingdings" w:hint="default"/>
+        <w:sz w:val="20"/>
+      </w:rPr>
+    </w:lvl>
+    <w:lvl w:ilvl="6" w:tentative="1">
+      <w:start w:val="1"/>
+      <w:numFmt w:val="bullet"/>
+      <w:lvlText w:val=""/>
+      <w:lvlJc w:val="left"/>
+      <w:pPr>
+        <w:tabs>
+          <w:tab w:val="num" w:pos="5040"/>
+        </w:tabs>
+        <w:ind w:left="5040" w:hanging="360"/>
+      </w:pPr>
+      <w:rPr>
+        <w:rFonts w:ascii="Wingdings" w:hAnsi="Wingdings" w:hint="default"/>
+        <w:sz w:val="20"/>
+      </w:rPr>
+    </w:lvl>
+    <w:lvl w:ilvl="7" w:tentative="1">
+      <w:start w:val="1"/>
+      <w:numFmt w:val="bullet"/>
+      <w:lvlText w:val=""/>
+      <w:lvlJc w:val="left"/>
+      <w:pPr>
+        <w:tabs>
+          <w:tab w:val="num" w:pos="5760"/>
+        </w:tabs>
+        <w:ind w:left="5760" w:hanging="360"/>
+      </w:pPr>
+      <w:rPr>
+        <w:rFonts w:ascii="Wingdings" w:hAnsi="Wingdings" w:hint="default"/>
+        <w:sz w:val="20"/>
+      </w:rPr>
+    </w:lvl>
+    <w:lvl w:ilvl="8" w:tentative="1">
+      <w:start w:val="1"/>
+      <w:numFmt w:val="bullet"/>
+      <w:lvlText w:val=""/>
+      <w:lvlJc w:val="left"/>
+      <w:pPr>
+        <w:tabs>
+          <w:tab w:val="num" w:pos="6480"/>
+        </w:tabs>
+        <w:ind w:left="6480" w:hanging="360"/>
+      </w:pPr>
+      <w:rPr>
+        <w:rFonts w:ascii="Wingdings" w:hAnsi="Wingdings" w:hint="default"/>
+        <w:sz w:val="20"/>
+      </w:rPr>
+    </w:lvl>
+  </w:abstractNum>
+  <w:abstractNum w:abstractNumId="2" w15:restartNumberingAfterBreak="0">
+    <w:nsid w:val="3EF15D0B"/>
+    <w:multiLevelType w:val="multilevel"/>
+    <w:tmpl w:val="6C08EE1E"/>
+    <w:lvl w:ilvl="0">
+      <w:start w:val="1"/>
+      <w:numFmt w:val="decimal"/>
+      <w:lvlText w:val="%1."/>
+      <w:lvlJc w:val="left"/>
+      <w:pPr>
+        <w:tabs>
+          <w:tab w:val="num" w:pos="720"/>
+        </w:tabs>
+        <w:ind w:left="720" w:hanging="360"/>
+      </w:pPr>
+    </w:lvl>
+    <w:lvl w:ilvl="1" w:tentative="1">
+      <w:start w:val="1"/>
+      <w:numFmt w:val="decimal"/>
+      <w:lvlText w:val="%2."/>
+      <w:lvlJc w:val="left"/>
+      <w:pPr>
+        <w:tabs>
+          <w:tab w:val="num" w:pos="1440"/>
+        </w:tabs>
+        <w:ind w:left="1440" w:hanging="360"/>
+      </w:pPr>
+    </w:lvl>
+    <w:lvl w:ilvl="2" w:tentative="1">
+      <w:start w:val="1"/>
+      <w:numFmt w:val="decimal"/>
+      <w:lvlText w:val="%3."/>
+      <w:lvlJc w:val="left"/>
+      <w:pPr>
+        <w:tabs>
+          <w:tab w:val="num" w:pos="2160"/>
+        </w:tabs>
+        <w:ind w:left="2160" w:hanging="360"/>
+      </w:pPr>
+    </w:lvl>
+    <w:lvl w:ilvl="3" w:tentative="1">
+      <w:start w:val="1"/>
+      <w:numFmt w:val="decimal"/>
+      <w:lvlText w:val="%4."/>
+      <w:lvlJc w:val="left"/>
+      <w:pPr>
+        <w:tabs>
+          <w:tab w:val="num" w:pos="2880"/>
+        </w:tabs>
+        <w:ind w:left="2880" w:hanging="360"/>
+      </w:pPr>
+    </w:lvl>
+    <w:lvl w:ilvl="4" w:tentative="1">
+      <w:start w:val="1"/>
+      <w:numFmt w:val="decimal"/>
+      <w:lvlText w:val="%5."/>
+      <w:lvlJc w:val="left"/>
+      <w:pPr>
+        <w:tabs>
+          <w:tab w:val="num" w:pos="3600"/>
+        </w:tabs>
+        <w:ind w:left="3600" w:hanging="360"/>
+      </w:pPr>
+    </w:lvl>
+    <w:lvl w:ilvl="5" w:tentative="1">
+      <w:start w:val="1"/>
+      <w:numFmt w:val="decimal"/>
+      <w:lvlText w:val="%6."/>
+      <w:lvlJc w:val="left"/>
+      <w:pPr>
+        <w:tabs>
+          <w:tab w:val="num" w:pos="4320"/>
+        </w:tabs>
+        <w:ind w:left="4320" w:hanging="360"/>
+      </w:pPr>
+    </w:lvl>
+    <w:lvl w:ilvl="6" w:tentative="1">
+      <w:start w:val="1"/>
+      <w:numFmt w:val="decimal"/>
+      <w:lvlText w:val="%7."/>
+      <w:lvlJc w:val="left"/>
+      <w:pPr>
+        <w:tabs>
+          <w:tab w:val="num" w:pos="5040"/>
+        </w:tabs>
+        <w:ind w:left="5040" w:hanging="360"/>
+      </w:pPr>
+    </w:lvl>
+    <w:lvl w:ilvl="7" w:tentative="1">
+      <w:start w:val="1"/>
+      <w:numFmt w:val="decimal"/>
+      <w:lvlText w:val="%8."/>
+      <w:lvlJc w:val="left"/>
+      <w:pPr>
+        <w:tabs>
+          <w:tab w:val="num" w:pos="5760"/>
+        </w:tabs>
+        <w:ind w:left="5760" w:hanging="360"/>
+      </w:pPr>
+    </w:lvl>
+    <w:lvl w:ilvl="8" w:tentative="1">
+      <w:start w:val="1"/>
+      <w:numFmt w:val="decimal"/>
+      <w:lvlText w:val="%9."/>
+      <w:lvlJc w:val="left"/>
+      <w:pPr>
+        <w:tabs>
+          <w:tab w:val="num" w:pos="6480"/>
+        </w:tabs>
+        <w:ind w:left="6480" w:hanging="360"/>
+      </w:pPr>
+    </w:lvl>
+  </w:abstractNum>
   <w:num w:numId="1" w16cid:durableId="795682126">
     <w:abstractNumId w:val="0"/>
+  </w:num>
+  <w:num w:numId="2" w16cid:durableId="1512528716">
+    <w:abstractNumId w:val="2"/>
+  </w:num>
+  <w:num w:numId="3" w16cid:durableId="1105077446">
+    <w:abstractNumId w:val="1"/>
   </w:num>
 </w:numbering>
 </file>
@@ -2414,7 +3299,6 @@
   <w:style w:type="character" w:default="1" w:styleId="DefaultParagraphFont">
     <w:name w:val="Default Paragraph Font"/>
     <w:uiPriority w:val="1"/>
-    <w:semiHidden/>
     <w:unhideWhenUsed/>
   </w:style>
   <w:style w:type="table" w:default="1" w:styleId="TableNormal">

</xml_diff>